<commit_message>
updated docs and max
</commit_message>
<xml_diff>
--- a/Documents/Cover Letters/Extras/Shitongeni/10. Twinrain Table of Contents Section Covers.docx
+++ b/Documents/Cover Letters/Extras/Shitongeni/10. Twinrain Table of Contents Section Covers.docx
@@ -1708,33 +1708,12 @@
     <w:p/>
     <w:p/>
     <w:p/>
-    <w:p/>
-    <w:p/>
-    <w:p/>
-    <w:p/>
-    <w:p/>
-    <w:p/>
-    <w:p/>
-    <w:p/>
-    <w:p/>
-    <w:p/>
-    <w:p/>
-    <w:p/>
-    <w:p/>
-    <w:p/>
-    <w:p/>
-    <w:p/>
-    <w:p/>
-    <w:p/>
-    <w:p/>
-    <w:p/>
-    <w:p/>
-    <w:p/>
     <w:p>
       <w:r>
         <w:rPr>
           <w:noProof/>
         </w:rPr>
+        <w:lastRenderedPageBreak/>
         <mc:AlternateContent>
           <mc:Choice Requires="wps">
             <w:drawing>
@@ -2168,13 +2147,12 @@
     <w:p/>
     <w:p/>
     <w:p/>
-    <w:p/>
-    <w:p/>
     <w:p>
       <w:r>
         <w:rPr>
           <w:noProof/>
         </w:rPr>
+        <w:lastRenderedPageBreak/>
         <mc:AlternateContent>
           <mc:Choice Requires="wps">
             <w:drawing>

</xml_diff>